<commit_message>
Cambios en el script de generación de datos de prueba
</commit_message>
<xml_diff>
--- a/HidroSentinel_Manual_Usuario.docx
+++ b/HidroSentinel_Manual_Usuario.docx
@@ -1,6 +1,6 @@
 
 <file path=word/document.xml><?xml version="1.0" encoding="utf-8"?>
-<w:document xmlns:wpc="http://schemas.microsoft.com/office/word/2010/wordprocessingCanvas" xmlns:cx="http://schemas.microsoft.com/office/drawing/2014/chartex" xmlns:cx1="http://schemas.microsoft.com/office/drawing/2015/9/8/chartex" xmlns:cx2="http://schemas.microsoft.com/office/drawing/2015/10/21/chartex" xmlns:cx3="http://schemas.microsoft.com/office/drawing/2016/5/9/chartex" xmlns:cx4="http://schemas.microsoft.com/office/drawing/2016/5/10/chartex" xmlns:cx5="http://schemas.microsoft.com/office/drawing/2016/5/11/chartex" xmlns:cx6="http://schemas.microsoft.com/office/drawing/2016/5/12/chartex" xmlns:cx7="http://schemas.microsoft.com/office/drawing/2016/5/13/chartex" xmlns:cx8="http://schemas.microsoft.com/office/drawing/2016/5/14/chartex" xmlns:mc="http://schemas.openxmlformats.org/markup-compatibility/2006" xmlns:aink="http://schemas.microsoft.com/office/drawing/2016/ink" xmlns:am3d="http://schemas.microsoft.com/office/drawing/2017/model3d" xmlns:o="urn:schemas-microsoft-com:office:office" xmlns:oel="http://schemas.microsoft.com/office/2019/extlst" xmlns:r="http://schemas.openxmlformats.org/officeDocument/2006/relationships" xmlns:m="http://schemas.openxmlformats.org/officeDocument/2006/math" xmlns:v="urn:schemas-microsoft-com:vml" xmlns:wp14="http://schemas.microsoft.com/office/word/2010/wordprocessingDrawing" xmlns:wp="http://schemas.openxmlformats.org/drawingml/2006/wordprocessingDrawing" xmlns:w10="urn:schemas-microsoft-com:office:word" xmlns:w="http://schemas.openxmlformats.org/wordprocessingml/2006/main" xmlns:w14="http://schemas.microsoft.com/office/word/2010/wordml" xmlns:w15="http://schemas.microsoft.com/office/word/2012/wordml" xmlns:w16cex="http://schemas.microsoft.com/office/word/2018/wordml/cex" xmlns:w16cid="http://schemas.microsoft.com/office/word/2016/wordml/cid" xmlns:w16="http://schemas.microsoft.com/office/word/2018/wordml" xmlns:w16du="http://schemas.microsoft.com/office/word/2023/wordml/word16du" xmlns:w16sdtdh="http://schemas.microsoft.com/office/word/2020/wordml/sdtdatahash" xmlns:w16sdtfl="http://schemas.microsoft.com/office/word/2024/wordml/sdtformatlock" xmlns:w16se="http://schemas.microsoft.com/office/word/2015/wordml/symex" xmlns:wpg="http://schemas.microsoft.com/office/word/2010/wordprocessingGroup" xmlns:wpi="http://schemas.microsoft.com/office/word/2010/wordprocessingInk" xmlns:wne="http://schemas.microsoft.com/office/word/2006/wordml" xmlns:wps="http://schemas.microsoft.com/office/word/2010/wordprocessingShape" mc:Ignorable="w14 w15 w16se w16cid w16 w16cex w16sdtdh w16sdtfl w16du wp14">
+<w:document xmlns:wpc="http://schemas.microsoft.com/office/word/2010/wordprocessingCanvas" xmlns:cx="http://schemas.microsoft.com/office/drawing/2014/chartex" xmlns:cx1="http://schemas.microsoft.com/office/drawing/2015/9/8/chartex" xmlns:cx2="http://schemas.microsoft.com/office/drawing/2015/10/21/chartex" xmlns:cx3="http://schemas.microsoft.com/office/drawing/2016/5/9/chartex" xmlns:cx4="http://schemas.microsoft.com/office/drawing/2016/5/10/chartex" xmlns:cx5="http://schemas.microsoft.com/office/drawing/2016/5/11/chartex" xmlns:cx6="http://schemas.microsoft.com/office/drawing/2016/5/12/chartex" xmlns:cx7="http://schemas.microsoft.com/office/drawing/2016/5/13/chartex" xmlns:cx8="http://schemas.microsoft.com/office/drawing/2016/5/14/chartex" xmlns:mc="http://schemas.openxmlformats.org/markup-compatibility/2006" xmlns:aink="http://schemas.microsoft.com/office/drawing/2016/ink" xmlns:am3d="http://schemas.microsoft.com/office/drawing/2017/model3d" xmlns:o="urn:schemas-microsoft-com:office:office" xmlns:r="http://schemas.openxmlformats.org/officeDocument/2006/relationships" xmlns:m="http://schemas.openxmlformats.org/officeDocument/2006/math" xmlns:v="urn:schemas-microsoft-com:vml" xmlns:wp14="http://schemas.microsoft.com/office/word/2010/wordprocessingDrawing" xmlns:wp="http://schemas.openxmlformats.org/drawingml/2006/wordprocessingDrawing" xmlns:w10="urn:schemas-microsoft-com:office:word" xmlns:w="http://schemas.openxmlformats.org/wordprocessingml/2006/main" xmlns:w14="http://schemas.microsoft.com/office/word/2010/wordml" xmlns:w15="http://schemas.microsoft.com/office/word/2012/wordml" xmlns:w16cex="http://schemas.microsoft.com/office/word/2018/wordml/cex" xmlns:w16cid="http://schemas.microsoft.com/office/word/2016/wordml/cid" xmlns:w16="http://schemas.microsoft.com/office/word/2018/wordml" xmlns:w16sdtdh="http://schemas.microsoft.com/office/word/2020/wordml/sdtdatahash" xmlns:w16se="http://schemas.microsoft.com/office/word/2015/wordml/symex" xmlns:wpg="http://schemas.microsoft.com/office/word/2010/wordprocessingGroup" xmlns:wpi="http://schemas.microsoft.com/office/word/2010/wordprocessingInk" xmlns:wne="http://schemas.microsoft.com/office/word/2006/wordml" xmlns:wps="http://schemas.microsoft.com/office/word/2010/wordprocessingShape" mc:Ignorable="w14 w15 w16se w16cid w16 w16cex w16sdtdh wp14">
   <w:body>
     <w:p>
       <w:pPr>
@@ -322,7 +322,10 @@
         <w:spacing w:after="120"/>
       </w:pPr>
       <w:r>
-        <w:t>HidroSentinel es una plataforma web para el monitoreo en tiempo real de parámetros fisicoquímicos del agua mediante boyas inteligentes. Permite ingestar, visualizar y analizar datos de sensores, y recibir alertas automáticas cuando alguna lectura supera los umbrales de riesgo configurados.</w:t>
+        <w:t xml:space="preserve">HidroSentinel es una plataforma web para el </w:t>
+      </w:r>
+      <w:r>
+        <w:t>monitoreo en tiempo real de parámetros fisicoquímicos del agua mediante boyas inteligentes. Permite ingestar, visualizar y analizar datos de sensores, y recibir alertas automáticas cuando alguna lectura supera los umbrales de riesgo configurados.</w:t>
       </w:r>
     </w:p>
     <w:p>
@@ -381,14 +384,27 @@
       <w:r>
         <w:t xml:space="preserve">Ilustración </w:t>
       </w:r>
-      <w:fldSimple w:instr=" SEQ Ilustración \* ARABIC ">
-        <w:r>
-          <w:rPr>
-            <w:noProof/>
-          </w:rPr>
-          <w:t>1</w:t>
-        </w:r>
-      </w:fldSimple>
+      <w:r>
+        <w:fldChar w:fldCharType="begin"/>
+      </w:r>
+      <w:r>
+        <w:instrText xml:space="preserve"> SEQ Ilustración \* ARABIC </w:instrText>
+      </w:r>
+      <w:r>
+        <w:fldChar w:fldCharType="separate"/>
+      </w:r>
+      <w:r>
+        <w:rPr>
+          <w:noProof/>
+        </w:rPr>
+        <w:t>1</w:t>
+      </w:r>
+      <w:r>
+        <w:rPr>
+          <w:noProof/>
+        </w:rPr>
+        <w:fldChar w:fldCharType="end"/>
+      </w:r>
       <w:r>
         <w:t xml:space="preserve"> Pantalla Principal</w:t>
       </w:r>
@@ -564,7 +580,14 @@
                 <w:sz w:val="21"/>
                 <w:szCs w:val="21"/>
               </w:rPr>
-              <w:t>Administración de cuentas, roles y perfiles.</w:t>
+              <w:t xml:space="preserve">Administración de cuentas, roles y </w:t>
+            </w:r>
+            <w:r>
+              <w:rPr>
+                <w:sz w:val="21"/>
+                <w:szCs w:val="21"/>
+              </w:rPr>
+              <w:t>perfiles.</w:t>
             </w:r>
           </w:p>
         </w:tc>
@@ -900,7 +923,14 @@
                 <w:sz w:val="21"/>
                 <w:szCs w:val="21"/>
               </w:rPr>
-              <w:t>Acceso total: crear y eliminar usuarios, asignar roles, gestionar boyas y sensores, cargar telemetría, ver alertas y estadísticas.</w:t>
+              <w:t xml:space="preserve">Acceso total: crear y eliminar usuarios, asignar roles, </w:t>
+            </w:r>
+            <w:r>
+              <w:rPr>
+                <w:sz w:val="21"/>
+                <w:szCs w:val="21"/>
+              </w:rPr>
+              <w:t>gestionar boyas y sensores, cargar telemetría, ver alertas y estadísticas.</w:t>
             </w:r>
           </w:p>
         </w:tc>
@@ -999,7 +1029,14 @@
                 <w:sz w:val="21"/>
                 <w:szCs w:val="21"/>
               </w:rPr>
-              <w:t>A lo largo de este manual, cada sección indica qué rol es necesario para ejecutar cada acción.</w:t>
+              <w:t xml:space="preserve">A lo largo de este manual, cada </w:t>
+            </w:r>
+            <w:r>
+              <w:rPr>
+                <w:sz w:val="21"/>
+                <w:szCs w:val="21"/>
+              </w:rPr>
+              <w:t>sección indica qué rol es necesario para ejecutar cada acción.</w:t>
             </w:r>
           </w:p>
         </w:tc>
@@ -1339,7 +1376,15 @@
         <w:t xml:space="preserve">2.  </w:t>
       </w:r>
       <w:r>
-        <w:t>Copia la plantilla de configuración: duplica .env.example como .env.</w:t>
+        <w:t xml:space="preserve">Copia la plantilla de configuración: </w:t>
+      </w:r>
+      <w:proofErr w:type="gramStart"/>
+      <w:r>
+        <w:t>duplica .env</w:t>
+      </w:r>
+      <w:proofErr w:type="gramEnd"/>
+      <w:r>
+        <w:t>.example como .env.</w:t>
       </w:r>
     </w:p>
     <w:p>
@@ -1356,7 +1401,15 @@
         <w:t xml:space="preserve">3.  </w:t>
       </w:r>
       <w:r>
-        <w:t>Completa los valores del archivo .env: define un JWT_SECRET largo y aleatorio, un INFLUXDB_TOKEN seguro, y verifica que PG_PORT coincida con POSTGRES_PORT.</w:t>
+        <w:t xml:space="preserve">Completa los valores del </w:t>
+      </w:r>
+      <w:proofErr w:type="gramStart"/>
+      <w:r>
+        <w:t>archivo .env</w:t>
+      </w:r>
+      <w:proofErr w:type="gramEnd"/>
+      <w:r>
+        <w:t>: define un JWT_SECRET largo y aleatorio, un INFLUXDB_TOKEN seguro, y verifica que PG_PORT coincida con POSTGRES_PORT.</w:t>
       </w:r>
     </w:p>
     <w:p>
@@ -1420,14 +1473,27 @@
       <w:r>
         <w:t xml:space="preserve">Ilustración </w:t>
       </w:r>
-      <w:fldSimple w:instr=" SEQ Ilustración \* ARABIC ">
-        <w:r>
-          <w:rPr>
-            <w:noProof/>
-          </w:rPr>
-          <w:t>2</w:t>
-        </w:r>
-      </w:fldSimple>
+      <w:r>
+        <w:fldChar w:fldCharType="begin"/>
+      </w:r>
+      <w:r>
+        <w:instrText xml:space="preserve"> SEQ Ilustración \* ARABIC </w:instrText>
+      </w:r>
+      <w:r>
+        <w:fldChar w:fldCharType="separate"/>
+      </w:r>
+      <w:r>
+        <w:rPr>
+          <w:noProof/>
+        </w:rPr>
+        <w:t>2</w:t>
+      </w:r>
+      <w:r>
+        <w:rPr>
+          <w:noProof/>
+        </w:rPr>
+        <w:fldChar w:fldCharType="end"/>
+      </w:r>
       <w:r>
         <w:t xml:space="preserve"> Ejemplo de Variables de entorno</w:t>
       </w:r>
@@ -1808,8 +1874,13 @@
       <w:pPr>
         <w:spacing w:after="120"/>
       </w:pPr>
-      <w:r>
-        <w:t>Credenciales  del administrador inicial:</w:t>
+      <w:proofErr w:type="gramStart"/>
+      <w:r>
+        <w:t>Credenciales  del</w:t>
+      </w:r>
+      <w:proofErr w:type="gramEnd"/>
+      <w:r>
+        <w:t xml:space="preserve"> administrador inicial:</w:t>
       </w:r>
     </w:p>
     <w:p>
@@ -1857,8 +1928,13 @@
         <w:t>Contraseña</w:t>
       </w:r>
       <w:r>
-        <w:t>: Admin2026!</w:t>
-      </w:r>
+        <w:t xml:space="preserve">: </w:t>
+      </w:r>
+      <w:proofErr w:type="gramStart"/>
+      <w:r>
+        <w:t>Admin2026!</w:t>
+      </w:r>
+      <w:proofErr w:type="gramEnd"/>
     </w:p>
     <w:tbl>
       <w:tblPr>
@@ -2405,14 +2481,27 @@
       <w:r>
         <w:t xml:space="preserve">Ilustración </w:t>
       </w:r>
-      <w:fldSimple w:instr=" SEQ Ilustración \* ARABIC ">
-        <w:r>
-          <w:rPr>
-            <w:noProof/>
-          </w:rPr>
-          <w:t>3</w:t>
-        </w:r>
-      </w:fldSimple>
+      <w:r>
+        <w:fldChar w:fldCharType="begin"/>
+      </w:r>
+      <w:r>
+        <w:instrText xml:space="preserve"> SEQ Ilustración \* ARABIC </w:instrText>
+      </w:r>
+      <w:r>
+        <w:fldChar w:fldCharType="separate"/>
+      </w:r>
+      <w:r>
+        <w:rPr>
+          <w:noProof/>
+        </w:rPr>
+        <w:t>3</w:t>
+      </w:r>
+      <w:r>
+        <w:rPr>
+          <w:noProof/>
+        </w:rPr>
+        <w:fldChar w:fldCharType="end"/>
+      </w:r>
       <w:r>
         <w:t xml:space="preserve"> Listado de contenedores operativos</w:t>
       </w:r>
@@ -2427,7 +2516,10 @@
         <w:spacing w:after="120"/>
       </w:pPr>
       <w:r>
-        <w:t>Autenticación</w:t>
+        <w:t>Autenti</w:t>
+      </w:r>
+      <w:r>
+        <w:t>cación</w:t>
       </w:r>
     </w:p>
     <w:p>
@@ -2491,7 +2583,10 @@
         <w:t xml:space="preserve">2.  </w:t>
       </w:r>
       <w:r>
-        <w:t>Escribe tu correo electrónico en el campo "Correo".</w:t>
+        <w:t xml:space="preserve">Escribe tu correo </w:t>
+      </w:r>
+      <w:r>
+        <w:t>electrónico en el campo "Correo".</w:t>
       </w:r>
     </w:p>
     <w:p>
@@ -2588,14 +2683,30 @@
       <w:r>
         <w:t xml:space="preserve">Ilustración </w:t>
       </w:r>
-      <w:fldSimple w:instr=" SEQ Ilustración \* ARABIC ">
-        <w:r>
-          <w:rPr>
-            <w:noProof/>
-          </w:rPr>
-          <w:t>4</w:t>
-        </w:r>
-      </w:fldSimple>
+      <w:r>
+        <w:fldChar w:fldCharType="begin"/>
+      </w:r>
+      <w:r>
+        <w:instrText xml:space="preserve"> SEQ Ilust</w:instrText>
+      </w:r>
+      <w:r>
+        <w:instrText xml:space="preserve">ración \* ARABIC </w:instrText>
+      </w:r>
+      <w:r>
+        <w:fldChar w:fldCharType="separate"/>
+      </w:r>
+      <w:r>
+        <w:rPr>
+          <w:noProof/>
+        </w:rPr>
+        <w:t>4</w:t>
+      </w:r>
+      <w:r>
+        <w:rPr>
+          <w:noProof/>
+        </w:rPr>
+        <w:fldChar w:fldCharType="end"/>
+      </w:r>
       <w:r>
         <w:t xml:space="preserve"> Login</w:t>
       </w:r>
@@ -2939,7 +3050,14 @@
                 <w:sz w:val="20"/>
                 <w:szCs w:val="20"/>
               </w:rPr>
-              <w:t>El correo no existe o la contraseña es incorrecta. El mensaje es genérico por seguridad. Verifica ambos datos.</w:t>
+              <w:t xml:space="preserve">El correo no </w:t>
+            </w:r>
+            <w:r>
+              <w:rPr>
+                <w:sz w:val="20"/>
+                <w:szCs w:val="20"/>
+              </w:rPr>
+              <w:t>existe o la contraseña es incorrecta. El mensaje es genérico por seguridad. Verifica ambos datos.</w:t>
             </w:r>
           </w:p>
         </w:tc>
@@ -3013,7 +3131,10 @@
       </w:pPr>
       <w:r>
         <w:lastRenderedPageBreak/>
-        <w:t>Roles requeridos: ADMINISTRADOR, OPERADOR</w:t>
+        <w:t xml:space="preserve">Roles requeridos: </w:t>
+      </w:r>
+      <w:r>
+        <w:t>ADMINISTRADOR, OPERADOR</w:t>
       </w:r>
     </w:p>
     <w:p>
@@ -3119,14 +3240,27 @@
       <w:r>
         <w:t xml:space="preserve">Ilustración </w:t>
       </w:r>
-      <w:fldSimple w:instr=" SEQ Ilustración \* ARABIC ">
-        <w:r>
-          <w:rPr>
-            <w:noProof/>
-          </w:rPr>
-          <w:t>5</w:t>
-        </w:r>
-      </w:fldSimple>
+      <w:r>
+        <w:fldChar w:fldCharType="begin"/>
+      </w:r>
+      <w:r>
+        <w:instrText xml:space="preserve"> SEQ Ilustración \* ARABIC </w:instrText>
+      </w:r>
+      <w:r>
+        <w:fldChar w:fldCharType="separate"/>
+      </w:r>
+      <w:r>
+        <w:rPr>
+          <w:noProof/>
+        </w:rPr>
+        <w:t>5</w:t>
+      </w:r>
+      <w:r>
+        <w:rPr>
+          <w:noProof/>
+        </w:rPr>
+        <w:fldChar w:fldCharType="end"/>
+      </w:r>
       <w:r>
         <w:t xml:space="preserve"> Cambio de contraseña desde perfil de administrador</w:t>
       </w:r>
@@ -3209,14 +3343,27 @@
       <w:r>
         <w:t xml:space="preserve">Ilustración </w:t>
       </w:r>
-      <w:fldSimple w:instr=" SEQ Ilustración \* ARABIC ">
-        <w:r>
-          <w:rPr>
-            <w:noProof/>
-          </w:rPr>
-          <w:t>6</w:t>
-        </w:r>
-      </w:fldSimple>
+      <w:r>
+        <w:fldChar w:fldCharType="begin"/>
+      </w:r>
+      <w:r>
+        <w:instrText xml:space="preserve"> SEQ Ilustración \* ARABIC </w:instrText>
+      </w:r>
+      <w:r>
+        <w:fldChar w:fldCharType="separate"/>
+      </w:r>
+      <w:r>
+        <w:rPr>
+          <w:noProof/>
+        </w:rPr>
+        <w:t>6</w:t>
+      </w:r>
+      <w:r>
+        <w:rPr>
+          <w:noProof/>
+        </w:rPr>
+        <w:fldChar w:fldCharType="end"/>
+      </w:r>
       <w:r>
         <w:t xml:space="preserve"> Cambio de contraseña desde un perfil de operador</w:t>
       </w:r>
@@ -3284,7 +3431,10 @@
         <w:t xml:space="preserve">1.  </w:t>
       </w:r>
       <w:r>
-        <w:t xml:space="preserve">Haz clic en el ícono o nombre de usuario en la parte </w:t>
+        <w:t>Haz clic en el ícono o nombre de usu</w:t>
+      </w:r>
+      <w:r>
+        <w:t xml:space="preserve">ario en la parte </w:t>
       </w:r>
       <w:r>
         <w:t>inferior</w:t>
@@ -3376,14 +3526,27 @@
       <w:r>
         <w:t xml:space="preserve">Ilustración </w:t>
       </w:r>
-      <w:fldSimple w:instr=" SEQ Ilustración \* ARABIC ">
-        <w:r>
-          <w:rPr>
-            <w:noProof/>
-          </w:rPr>
-          <w:t>7</w:t>
-        </w:r>
-      </w:fldSimple>
+      <w:r>
+        <w:fldChar w:fldCharType="begin"/>
+      </w:r>
+      <w:r>
+        <w:instrText xml:space="preserve"> SEQ Ilustración \* ARABIC </w:instrText>
+      </w:r>
+      <w:r>
+        <w:fldChar w:fldCharType="separate"/>
+      </w:r>
+      <w:r>
+        <w:rPr>
+          <w:noProof/>
+        </w:rPr>
+        <w:t>7</w:t>
+      </w:r>
+      <w:r>
+        <w:rPr>
+          <w:noProof/>
+        </w:rPr>
+        <w:fldChar w:fldCharType="end"/>
+      </w:r>
       <w:r>
         <w:t xml:space="preserve"> Cerrar Sesión</w:t>
       </w:r>
@@ -3406,7 +3569,10 @@
         <w:spacing w:after="120"/>
       </w:pPr>
       <w:r>
-        <w:t>Administración completa de cuentas: creación, edición de datos, asignación de roles y eliminación. La mayoría de estas acciones requieren el rol de Administrador.</w:t>
+        <w:t>Administración completa de cuentas: creación</w:t>
+      </w:r>
+      <w:r>
+        <w:t>, edición de datos, asignación de roles y eliminación. La mayoría de estas acciones requieren el rol de Administrador.</w:t>
       </w:r>
     </w:p>
     <w:p>
@@ -3469,14 +3635,27 @@
       <w:r>
         <w:t xml:space="preserve">Ilustración </w:t>
       </w:r>
-      <w:fldSimple w:instr=" SEQ Ilustración \* ARABIC ">
-        <w:r>
-          <w:rPr>
-            <w:noProof/>
-          </w:rPr>
-          <w:t>8</w:t>
-        </w:r>
-      </w:fldSimple>
+      <w:r>
+        <w:fldChar w:fldCharType="begin"/>
+      </w:r>
+      <w:r>
+        <w:instrText xml:space="preserve"> SEQ Ilustración \* ARABIC </w:instrText>
+      </w:r>
+      <w:r>
+        <w:fldChar w:fldCharType="separate"/>
+      </w:r>
+      <w:r>
+        <w:rPr>
+          <w:noProof/>
+        </w:rPr>
+        <w:t>8</w:t>
+      </w:r>
+      <w:r>
+        <w:rPr>
+          <w:noProof/>
+        </w:rPr>
+        <w:fldChar w:fldCharType="end"/>
+      </w:r>
       <w:r>
         <w:t xml:space="preserve"> Pantalla de administración de usuarios</w:t>
       </w:r>
@@ -3507,7 +3686,10 @@
         <w:spacing w:after="120"/>
       </w:pPr>
       <w:r>
-        <w:t>La tabla muestra todos los usuarios registrados con nombre completo, correo, cédula y roles activos. Desde cada fila se puede editar datos, gestionar roles, cambiar contraseña o eliminar el usuario.</w:t>
+        <w:t>La t</w:t>
+      </w:r>
+      <w:r>
+        <w:t>abla muestra todos los usuarios registrados con nombre completo, correo, cédula y roles activos. Desde cada fila se puede editar datos, gestionar roles, cambiar contraseña o eliminar el usuario.</w:t>
       </w:r>
     </w:p>
     <w:p>
@@ -3551,7 +3733,10 @@
         <w:t xml:space="preserve">1.  </w:t>
       </w:r>
       <w:r>
-        <w:t>Haz clic en "Nuevo usuario" en la parte superior de la página.</w:t>
+        <w:t xml:space="preserve">Haz clic en </w:t>
+      </w:r>
+      <w:r>
+        <w:t>"Nuevo usuario" en la parte superior de la página.</w:t>
       </w:r>
     </w:p>
     <w:p>
@@ -3648,14 +3833,27 @@
       <w:r>
         <w:t xml:space="preserve">Ilustración </w:t>
       </w:r>
-      <w:fldSimple w:instr=" SEQ Ilustración \* ARABIC ">
-        <w:r>
-          <w:rPr>
-            <w:noProof/>
-          </w:rPr>
-          <w:t>9</w:t>
-        </w:r>
-      </w:fldSimple>
+      <w:r>
+        <w:fldChar w:fldCharType="begin"/>
+      </w:r>
+      <w:r>
+        <w:instrText xml:space="preserve"> SEQ Ilustración \* ARABIC </w:instrText>
+      </w:r>
+      <w:r>
+        <w:fldChar w:fldCharType="separate"/>
+      </w:r>
+      <w:r>
+        <w:rPr>
+          <w:noProof/>
+        </w:rPr>
+        <w:t>9</w:t>
+      </w:r>
+      <w:r>
+        <w:rPr>
+          <w:noProof/>
+        </w:rPr>
+        <w:fldChar w:fldCharType="end"/>
+      </w:r>
       <w:r>
         <w:t xml:space="preserve"> Formulario de creación de usuarios</w:t>
       </w:r>
@@ -3921,7 +4119,15 @@
                 <w:sz w:val="20"/>
                 <w:szCs w:val="20"/>
               </w:rPr>
-              <w:t>Dirección de correo única. No puede modificarse después de la creación.</w:t>
+              <w:t xml:space="preserve">Dirección de correo única. No puede modificarse después de la </w:t>
+            </w:r>
+            <w:r>
+              <w:rPr>
+                <w:color w:val="000000"/>
+                <w:sz w:val="20"/>
+                <w:szCs w:val="20"/>
+              </w:rPr>
+              <w:t>creación.</w:t>
             </w:r>
           </w:p>
         </w:tc>
@@ -4119,7 +4325,15 @@
                 <w:sz w:val="20"/>
                 <w:szCs w:val="20"/>
               </w:rPr>
-              <w:t>Rol inicial asignado. Se puede modificar posteriormente desde "Roles".</w:t>
+              <w:t xml:space="preserve">Rol inicial asignado. Se puede </w:t>
+            </w:r>
+            <w:r>
+              <w:rPr>
+                <w:color w:val="000000"/>
+                <w:sz w:val="20"/>
+                <w:szCs w:val="20"/>
+              </w:rPr>
+              <w:t>modificar posteriormente desde "Roles".</w:t>
             </w:r>
           </w:p>
         </w:tc>
@@ -4309,7 +4523,14 @@
                 <w:sz w:val="20"/>
                 <w:szCs w:val="20"/>
               </w:rPr>
-              <w:t>La cédula no pasa la validación del dígito verificador o tiene un formato incorrecto. Verifica que sean 10 dígitos numéricos.</w:t>
+              <w:t xml:space="preserve">La cédula no </w:t>
+            </w:r>
+            <w:r>
+              <w:rPr>
+                <w:sz w:val="20"/>
+                <w:szCs w:val="20"/>
+              </w:rPr>
+              <w:t>pasa la validación del dígito verificador o tiene un formato incorrecto. Verifica que sean 10 dígitos numéricos.</w:t>
             </w:r>
           </w:p>
         </w:tc>
@@ -4399,7 +4620,10 @@
         <w:t xml:space="preserve">1.  </w:t>
       </w:r>
       <w:r>
-        <w:t>En la lista de usuarios, haz clic en "Editar" en la fila del usuario.</w:t>
+        <w:t xml:space="preserve">En </w:t>
+      </w:r>
+      <w:r>
+        <w:t>la lista de usuarios, haz clic en "Editar" en la fila del usuario.</w:t>
       </w:r>
     </w:p>
     <w:p>
@@ -4491,14 +4715,27 @@
       <w:r>
         <w:t xml:space="preserve">Ilustración </w:t>
       </w:r>
-      <w:fldSimple w:instr=" SEQ Ilustración \* ARABIC ">
-        <w:r>
-          <w:rPr>
-            <w:noProof/>
-          </w:rPr>
-          <w:t>10</w:t>
-        </w:r>
-      </w:fldSimple>
+      <w:r>
+        <w:fldChar w:fldCharType="begin"/>
+      </w:r>
+      <w:r>
+        <w:instrText xml:space="preserve"> SEQ Ilustración \* ARABIC </w:instrText>
+      </w:r>
+      <w:r>
+        <w:fldChar w:fldCharType="separate"/>
+      </w:r>
+      <w:r>
+        <w:rPr>
+          <w:noProof/>
+        </w:rPr>
+        <w:t>10</w:t>
+      </w:r>
+      <w:r>
+        <w:rPr>
+          <w:noProof/>
+        </w:rPr>
+        <w:fldChar w:fldCharType="end"/>
+      </w:r>
       <w:r>
         <w:t xml:space="preserve"> Formulario para editar un usuario</w:t>
       </w:r>
@@ -4693,14 +4930,27 @@
       <w:r>
         <w:t xml:space="preserve">Ilustración </w:t>
       </w:r>
-      <w:fldSimple w:instr=" SEQ Ilustración \* ARABIC ">
-        <w:r>
-          <w:rPr>
-            <w:noProof/>
-          </w:rPr>
-          <w:t>11</w:t>
-        </w:r>
-      </w:fldSimple>
+      <w:r>
+        <w:fldChar w:fldCharType="begin"/>
+      </w:r>
+      <w:r>
+        <w:instrText xml:space="preserve"> SEQ Ilustración \* ARABIC </w:instrText>
+      </w:r>
+      <w:r>
+        <w:fldChar w:fldCharType="separate"/>
+      </w:r>
+      <w:r>
+        <w:rPr>
+          <w:noProof/>
+        </w:rPr>
+        <w:t>11</w:t>
+      </w:r>
+      <w:r>
+        <w:rPr>
+          <w:noProof/>
+        </w:rPr>
+        <w:fldChar w:fldCharType="end"/>
+      </w:r>
       <w:r>
         <w:t xml:space="preserve"> Asignación de roles</w:t>
       </w:r>
@@ -4761,7 +5011,14 @@
                 <w:sz w:val="21"/>
                 <w:szCs w:val="21"/>
               </w:rPr>
-              <w:t>Debes asignar al menos un rol. El sistema rechazará guardar si no hay ningún rol seleccionado. Quitar el rol de Administrador a tu propia cuenta puede dejarte sin acceso a esta funcionalidad.</w:t>
+              <w:t xml:space="preserve">Debes asignar al menos un rol. El sistema rechazará guardar si no hay ningún rol seleccionado. Quitar el rol de Administrador a tu propia cuenta puede dejarte sin acceso a esta </w:t>
+            </w:r>
+            <w:r>
+              <w:rPr>
+                <w:sz w:val="21"/>
+                <w:szCs w:val="21"/>
+              </w:rPr>
+              <w:t>funcionalidad.</w:t>
             </w:r>
           </w:p>
         </w:tc>
@@ -4841,7 +5098,10 @@
         <w:t xml:space="preserve">3.  </w:t>
       </w:r>
       <w:r>
-        <w:t>El usuario y todas sus asignaciones de rol son eliminados permanentemente.</w:t>
+        <w:t xml:space="preserve">El usuario y todas sus asignaciones de rol son eliminados </w:t>
+      </w:r>
+      <w:r>
+        <w:t>permanentemente.</w:t>
       </w:r>
     </w:p>
     <w:p>
@@ -4934,7 +5194,10 @@
         <w:spacing w:after="120"/>
       </w:pPr>
       <w:r>
-        <w:t>Configuración de la infraestructura de medición. Las boyas representan dispositivos físicos en campo. Cada boya puede tener uno o más sensores, y cada sensor tiene una unidad de medida con umbrales de riesgo definidos.</w:t>
+        <w:t xml:space="preserve">Configuración de la infraestructura de medición. Las boyas representan dispositivos físicos en </w:t>
+      </w:r>
+      <w:r>
+        <w:t>campo. Cada boya puede tener uno o más sensores, y cada sensor tiene una unidad de medida con umbrales de riesgo definidos.</w:t>
       </w:r>
     </w:p>
     <w:p>
@@ -4993,14 +5256,27 @@
       <w:r>
         <w:t xml:space="preserve">Ilustración </w:t>
       </w:r>
-      <w:fldSimple w:instr=" SEQ Ilustración \* ARABIC ">
-        <w:r>
-          <w:rPr>
-            <w:noProof/>
-          </w:rPr>
-          <w:t>12</w:t>
-        </w:r>
-      </w:fldSimple>
+      <w:r>
+        <w:fldChar w:fldCharType="begin"/>
+      </w:r>
+      <w:r>
+        <w:instrText xml:space="preserve"> SEQ Ilustración \* ARABIC </w:instrText>
+      </w:r>
+      <w:r>
+        <w:fldChar w:fldCharType="separate"/>
+      </w:r>
+      <w:r>
+        <w:rPr>
+          <w:noProof/>
+        </w:rPr>
+        <w:t>12</w:t>
+      </w:r>
+      <w:r>
+        <w:rPr>
+          <w:noProof/>
+        </w:rPr>
+        <w:fldChar w:fldCharType="end"/>
+      </w:r>
       <w:r>
         <w:t xml:space="preserve"> Módulo de administración de las boyas y sensores</w:t>
       </w:r>
@@ -5023,7 +5299,10 @@
         <w:spacing w:after="120"/>
       </w:pPr>
       <w:r>
-        <w:t>Rol requerido para crear/editar/eliminar: ADMINISTRADOR</w:t>
+        <w:t>Rol requerido para c</w:t>
+      </w:r>
+      <w:r>
+        <w:t>rear/editar/eliminar: ADMINISTRADOR</w:t>
       </w:r>
     </w:p>
     <w:p>
@@ -5146,14 +5425,27 @@
       <w:r>
         <w:t xml:space="preserve">Ilustración </w:t>
       </w:r>
-      <w:fldSimple w:instr=" SEQ Ilustración \* ARABIC ">
-        <w:r>
-          <w:rPr>
-            <w:noProof/>
-          </w:rPr>
-          <w:t>13</w:t>
-        </w:r>
-      </w:fldSimple>
+      <w:r>
+        <w:fldChar w:fldCharType="begin"/>
+      </w:r>
+      <w:r>
+        <w:instrText xml:space="preserve"> SEQ Ilustración \* ARABIC </w:instrText>
+      </w:r>
+      <w:r>
+        <w:fldChar w:fldCharType="separate"/>
+      </w:r>
+      <w:r>
+        <w:rPr>
+          <w:noProof/>
+        </w:rPr>
+        <w:t>13</w:t>
+      </w:r>
+      <w:r>
+        <w:rPr>
+          <w:noProof/>
+        </w:rPr>
+        <w:fldChar w:fldCharType="end"/>
+      </w:r>
       <w:r>
         <w:t xml:space="preserve"> Formulario para creación de boyas</w:t>
       </w:r>
@@ -5246,7 +5538,10 @@
         <w:t xml:space="preserve">1.  </w:t>
       </w:r>
       <w:r>
-        <w:t>Haz clic en "Eliminar" junto a la boya.</w:t>
+        <w:t>Haz clic en "</w:t>
+      </w:r>
+      <w:r>
+        <w:t>Eliminar" junto a la boya.</w:t>
       </w:r>
     </w:p>
     <w:p>
@@ -5364,7 +5659,10 @@
         <w:spacing w:after="120"/>
       </w:pPr>
       <w:r>
-        <w:t>Los sensores se gestionan dentro del detalle de cada boya. Haz clic en el nombre de la boya para expandir su lista de sensores.</w:t>
+        <w:t xml:space="preserve">Los sensores se </w:t>
+      </w:r>
+      <w:r>
+        <w:t>gestionan dentro del detalle de cada boya. Haz clic en el nombre de la boya para expandir su lista de sensores.</w:t>
       </w:r>
     </w:p>
     <w:p>
@@ -5424,7 +5722,10 @@
         <w:t xml:space="preserve">3.  </w:t>
       </w:r>
       <w:r>
-        <w:t>Haz clic en "Guardar".</w:t>
+        <w:t xml:space="preserve">Haz clic en </w:t>
+      </w:r>
+      <w:r>
+        <w:t>"Guardar".</w:t>
       </w:r>
     </w:p>
     <w:p>
@@ -5487,14 +5788,27 @@
       <w:r>
         <w:t xml:space="preserve">Ilustración </w:t>
       </w:r>
-      <w:fldSimple w:instr=" SEQ Ilustración \* ARABIC ">
-        <w:r>
-          <w:rPr>
-            <w:noProof/>
-          </w:rPr>
-          <w:t>14</w:t>
-        </w:r>
-      </w:fldSimple>
+      <w:r>
+        <w:fldChar w:fldCharType="begin"/>
+      </w:r>
+      <w:r>
+        <w:instrText xml:space="preserve"> SEQ Ilustración \* ARABIC </w:instrText>
+      </w:r>
+      <w:r>
+        <w:fldChar w:fldCharType="separate"/>
+      </w:r>
+      <w:r>
+        <w:rPr>
+          <w:noProof/>
+        </w:rPr>
+        <w:t>14</w:t>
+      </w:r>
+      <w:r>
+        <w:rPr>
+          <w:noProof/>
+        </w:rPr>
+        <w:fldChar w:fldCharType="end"/>
+      </w:r>
       <w:r>
         <w:t xml:space="preserve"> Formulario de creación de sensores</w:t>
       </w:r>
@@ -5632,7 +5946,15 @@
                 <w:sz w:val="20"/>
                 <w:szCs w:val="20"/>
               </w:rPr>
-              <w:t>Nombre descriptivo. Debe coincidir con la cabecera de la columna en el CSV o con la nomenclatura de su unidad para que la telemetría se vincule correctamente.</w:t>
+              <w:t>Nombre descriptivo. Debe coincidir con la cabecera de la columna en el CSV o con la nomenclatura de su unidad para que la telem</w:t>
+            </w:r>
+            <w:r>
+              <w:rPr>
+                <w:color w:val="000000"/>
+                <w:sz w:val="20"/>
+                <w:szCs w:val="20"/>
+              </w:rPr>
+              <w:t>etría se vincule correctamente.</w:t>
             </w:r>
           </w:p>
         </w:tc>
@@ -5809,7 +6131,16 @@
                 <w:sz w:val="20"/>
                 <w:szCs w:val="20"/>
               </w:rPr>
-              <w:t>Umbral de riesgo máx</w:t>
+              <w:t xml:space="preserve">Umbral de </w:t>
+            </w:r>
+            <w:r>
+              <w:rPr>
+                <w:rFonts w:ascii="Consolas" w:eastAsia="Consolas" w:hAnsi="Consolas" w:cs="Consolas"/>
+                <w:color w:val="1565A6"/>
+                <w:sz w:val="20"/>
+                <w:szCs w:val="20"/>
+              </w:rPr>
+              <w:t>riesgo máx</w:t>
             </w:r>
           </w:p>
         </w:tc>
@@ -5976,7 +6307,14 @@
                 <w:szCs w:val="21"/>
               </w:rPr>
               <w:lastRenderedPageBreak/>
-              <w:t>El sistema busca la columna del CSV por nombre normalizado del sensor o por nomenclatura de su unidad. Si el sensor se llama "pH" o si su unidad es "pH", ambas cabeceras de CSV serán reconocidas automáticamente.</w:t>
+              <w:t xml:space="preserve">El sistema busca la columna del CSV por </w:t>
+            </w:r>
+            <w:r>
+              <w:rPr>
+                <w:sz w:val="21"/>
+                <w:szCs w:val="21"/>
+              </w:rPr>
+              <w:t>nombre normalizado del sensor o por nomenclatura de su unidad. Si el sensor se llama "pH" o si su unidad es "pH", ambas cabeceras de CSV serán reconocidas automáticamente.</w:t>
             </w:r>
           </w:p>
         </w:tc>
@@ -6013,7 +6351,10 @@
         <w:spacing w:after="120"/>
       </w:pPr>
       <w:r>
-        <w:t>Las unidades de medida son un catálogo compartido que todos los sensores usan. Se gestionan desde el botón "Unidades de medida" dentro del módulo de Boyas.</w:t>
+        <w:t>Las unidades de med</w:t>
+      </w:r>
+      <w:r>
+        <w:t>ida son un catálogo compartido que todos los sensores usan. Se gestionan desde el botón "Unidades de medida" dentro del módulo de Boyas.</w:t>
       </w:r>
     </w:p>
     <w:tbl>
@@ -6434,14 +6775,27 @@
       <w:r>
         <w:t xml:space="preserve">Ilustración </w:t>
       </w:r>
-      <w:fldSimple w:instr=" SEQ Ilustración \* ARABIC ">
-        <w:r>
-          <w:rPr>
-            <w:noProof/>
-          </w:rPr>
-          <w:t>15</w:t>
-        </w:r>
-      </w:fldSimple>
+      <w:r>
+        <w:fldChar w:fldCharType="begin"/>
+      </w:r>
+      <w:r>
+        <w:instrText xml:space="preserve"> SEQ Ilustración \* ARABIC </w:instrText>
+      </w:r>
+      <w:r>
+        <w:fldChar w:fldCharType="separate"/>
+      </w:r>
+      <w:r>
+        <w:rPr>
+          <w:noProof/>
+        </w:rPr>
+        <w:t>15</w:t>
+      </w:r>
+      <w:r>
+        <w:rPr>
+          <w:noProof/>
+        </w:rPr>
+        <w:fldChar w:fldCharType="end"/>
+      </w:r>
       <w:r>
         <w:t xml:space="preserve"> Configuración de niveles</w:t>
       </w:r>
@@ -6534,7 +6888,10 @@
         <w:spacing w:after="120"/>
       </w:pPr>
       <w:r>
-        <w:t>Módulo para la carga de archivos CSV generados por el datalogger, visualización gráfica de series temporales y análisis estadístico del período seleccionado.</w:t>
+        <w:t xml:space="preserve">Módulo para la carga de archivos CSV generados por el datalogger, visualización gráfica de series </w:t>
+      </w:r>
+      <w:r>
+        <w:t>temporales y análisis estadístico del período seleccionado.</w:t>
       </w:r>
     </w:p>
     <w:p>
@@ -6597,14 +6954,27 @@
       <w:r>
         <w:t xml:space="preserve">Ilustración </w:t>
       </w:r>
-      <w:fldSimple w:instr=" SEQ Ilustración \* ARABIC ">
-        <w:r>
-          <w:rPr>
-            <w:noProof/>
-          </w:rPr>
-          <w:t>16</w:t>
-        </w:r>
-      </w:fldSimple>
+      <w:r>
+        <w:fldChar w:fldCharType="begin"/>
+      </w:r>
+      <w:r>
+        <w:instrText xml:space="preserve"> SEQ Ilustración \* ARABIC </w:instrText>
+      </w:r>
+      <w:r>
+        <w:fldChar w:fldCharType="separate"/>
+      </w:r>
+      <w:r>
+        <w:rPr>
+          <w:noProof/>
+        </w:rPr>
+        <w:t>16</w:t>
+      </w:r>
+      <w:r>
+        <w:rPr>
+          <w:noProof/>
+        </w:rPr>
+        <w:fldChar w:fldCharType="end"/>
+      </w:r>
       <w:r>
         <w:t xml:space="preserve"> Pantalla de telemetría</w:t>
       </w:r>
@@ -6635,7 +7005,10 @@
         <w:spacing w:after="120"/>
       </w:pPr>
       <w:r>
-        <w:t>El archivo CSV debe tener: separador punto y coma (;), coma decimal, primera columna "Fecha" con formato dd/mm/aaaa hh:mm, y una columna por sensor.</w:t>
+        <w:t>El archivo CSV debe tener: separador punto y coma (;), coma deci</w:t>
+      </w:r>
+      <w:r>
+        <w:t>mal, primera columna "Fecha" con formato dd/mm/aaaa hh:mm, y una columna por sensor.</w:t>
       </w:r>
     </w:p>
     <w:p>
@@ -6669,7 +7042,10 @@
         <w:t xml:space="preserve">2.  </w:t>
       </w:r>
       <w:r>
-        <w:t>En la sección "Cargar archivo CSV", haz clic en "Seleccionar archivo" y elige el CSV desde tu equipo.</w:t>
+        <w:t xml:space="preserve">En la sección "Cargar archivo CSV", haz clic en "Seleccionar archivo" y elige el CSV desde tu </w:t>
+      </w:r>
+      <w:r>
+        <w:t>equipo.</w:t>
       </w:r>
     </w:p>
     <w:p>
@@ -6720,7 +7096,10 @@
         <w:t xml:space="preserve">5.  </w:t>
       </w:r>
       <w:r>
-        <w:t>Haz clic en "Confirmar y cargar". El sistema procesará el archivo y mostrará un resumen de filas cargadas.</w:t>
+        <w:t>Haz clic en "Confirmar y cargar". El sistema procesa</w:t>
+      </w:r>
+      <w:r>
+        <w:t>rá el archivo y mostrará un resumen de filas cargadas.</w:t>
       </w:r>
     </w:p>
     <w:p>
@@ -6784,14 +7163,27 @@
       <w:r>
         <w:t xml:space="preserve">Ilustración </w:t>
       </w:r>
-      <w:fldSimple w:instr=" SEQ Ilustración \* ARABIC ">
-        <w:r>
-          <w:rPr>
-            <w:noProof/>
-          </w:rPr>
-          <w:t>17</w:t>
-        </w:r>
-      </w:fldSimple>
+      <w:r>
+        <w:fldChar w:fldCharType="begin"/>
+      </w:r>
+      <w:r>
+        <w:instrText xml:space="preserve"> SEQ Ilustración \* ARABIC </w:instrText>
+      </w:r>
+      <w:r>
+        <w:fldChar w:fldCharType="separate"/>
+      </w:r>
+      <w:r>
+        <w:rPr>
+          <w:noProof/>
+        </w:rPr>
+        <w:t>17</w:t>
+      </w:r>
+      <w:r>
+        <w:rPr>
+          <w:noProof/>
+        </w:rPr>
+        <w:fldChar w:fldCharType="end"/>
+      </w:r>
       <w:r>
         <w:t xml:space="preserve"> Sección para cargar CSV</w:t>
       </w:r>
@@ -7175,7 +7567,14 @@
                 <w:sz w:val="21"/>
                 <w:szCs w:val="21"/>
               </w:rPr>
-              <w:t>La boya seleccionada debe tener al menos un sensor registrado antes de cargar telemetría.</w:t>
+              <w:t xml:space="preserve">La boya seleccionada debe tener al menos un sensor </w:t>
+            </w:r>
+            <w:r>
+              <w:rPr>
+                <w:sz w:val="21"/>
+                <w:szCs w:val="21"/>
+              </w:rPr>
+              <w:t>registrado antes de cargar telemetría.</w:t>
             </w:r>
           </w:p>
         </w:tc>
@@ -7267,14 +7666,27 @@
       <w:r>
         <w:t xml:space="preserve">Ilustración </w:t>
       </w:r>
-      <w:fldSimple w:instr=" SEQ Ilustración \* ARABIC ">
-        <w:r>
-          <w:rPr>
-            <w:noProof/>
-          </w:rPr>
-          <w:t>18</w:t>
-        </w:r>
-      </w:fldSimple>
+      <w:r>
+        <w:fldChar w:fldCharType="begin"/>
+      </w:r>
+      <w:r>
+        <w:instrText xml:space="preserve"> SEQ Ilustración \* ARABIC </w:instrText>
+      </w:r>
+      <w:r>
+        <w:fldChar w:fldCharType="separate"/>
+      </w:r>
+      <w:r>
+        <w:rPr>
+          <w:noProof/>
+        </w:rPr>
+        <w:t>18</w:t>
+      </w:r>
+      <w:r>
+        <w:rPr>
+          <w:noProof/>
+        </w:rPr>
+        <w:fldChar w:fldCharType="end"/>
+      </w:r>
       <w:r>
         <w:t xml:space="preserve"> Preview de la carga de archivos</w:t>
       </w:r>
@@ -7437,7 +7849,14 @@
                 <w:sz w:val="21"/>
                 <w:szCs w:val="21"/>
               </w:rPr>
-              <w:t>La columna fue vinculada al sensor cuya nomenclatura de unidad coincide con la cabecera del CSV.</w:t>
+              <w:t xml:space="preserve">La columna fue vinculada al sensor cuya nomenclatura de unidad coincide con la cabecera del </w:t>
+            </w:r>
+            <w:r>
+              <w:rPr>
+                <w:sz w:val="21"/>
+                <w:szCs w:val="21"/>
+              </w:rPr>
+              <w:t>CSV.</w:t>
             </w:r>
           </w:p>
         </w:tc>
@@ -7542,7 +7961,10 @@
         <w:spacing w:before="240" w:after="60"/>
       </w:pPr>
       <w:r>
-        <w:t>Asignación manual de columnas grises</w:t>
+        <w:t xml:space="preserve">Asignación manual de </w:t>
+      </w:r>
+      <w:r>
+        <w:t>columnas grises</w:t>
       </w:r>
     </w:p>
     <w:p>
@@ -7593,7 +8015,10 @@
         <w:t xml:space="preserve">3.  </w:t>
       </w:r>
       <w:r>
-        <w:t>Selecciona el sensor correspondiente. La fila cambiará a verde con el badge "Se cargará · manual".</w:t>
+        <w:t xml:space="preserve">Selecciona el sensor </w:t>
+      </w:r>
+      <w:r>
+        <w:t>correspondiente. La fila cambiará a verde con el badge "Se cargará · manual".</w:t>
       </w:r>
     </w:p>
     <w:p>
@@ -7642,7 +8067,7 @@
             <w:tcBorders>
               <w:top w:val="single" w:sz="12" w:space="0" w:color="F59E0B"/>
               <w:left w:val="single" w:sz="4" w:space="0" w:color="CFDBE6"/>
-              <w:bottom w:val="single" w:sz="4" w:space="0" w:color="CFDBE6"/>
+              <w:bottom w:val="single" w:sz="12" w:space="0" w:color="F59E0B"/>
               <w:right w:val="single" w:sz="4" w:space="0" w:color="CFDBE6"/>
             </w:tcBorders>
             <w:shd w:val="solid" w:color="FEF3C7" w:fill="auto"/>
@@ -7674,7 +8099,88 @@
                 <w:sz w:val="21"/>
                 <w:szCs w:val="21"/>
               </w:rPr>
-              <w:t>Si todas las columnas quedan sin sensor (grises), el botón "Confirmar y cargar" permanecerá deshabilitado. Asigna al menos una columna para poder cargar.</w:t>
+              <w:t>Si todas las columnas quedan sin sensor (grises), el botón "Confirmar y cargar" permanecerá deshab</w:t>
+            </w:r>
+            <w:r>
+              <w:rPr>
+                <w:sz w:val="21"/>
+                <w:szCs w:val="21"/>
+              </w:rPr>
+              <w:t>ilitado. Asigna al menos una columna para poder cargar.</w:t>
+            </w:r>
+          </w:p>
+        </w:tc>
+      </w:tr>
+      <w:tr>
+        <w:tc>
+          <w:tcPr>
+            <w:tcW w:w="0" w:type="auto"/>
+            <w:tcBorders>
+              <w:top w:val="single" w:sz="12" w:space="0" w:color="F59E0B"/>
+              <w:left w:val="single" w:sz="4" w:space="0" w:color="CFDBE6"/>
+              <w:bottom w:val="single" w:sz="4" w:space="0" w:color="CFDBE6"/>
+              <w:right w:val="single" w:sz="4" w:space="0" w:color="CFDBE6"/>
+            </w:tcBorders>
+            <w:shd w:val="solid" w:color="FEF3C7" w:fill="auto"/>
+            <w:tcMar>
+              <w:top w:w="80" w:type="dxa"/>
+              <w:left w:w="160" w:type="dxa"/>
+              <w:bottom w:w="80" w:type="dxa"/>
+              <w:right w:w="160" w:type="dxa"/>
+            </w:tcMar>
+          </w:tcPr>
+          <w:p>
+            <w:pPr>
+              <w:spacing w:after="40"/>
+              <w:rPr>
+                <w:b/>
+                <w:bCs/>
+                <w:color w:val="F59E0B"/>
+                <w:sz w:val="20"/>
+                <w:szCs w:val="20"/>
+              </w:rPr>
+            </w:pPr>
+            <w:r>
+              <w:rPr>
+                <w:b/>
+                <w:bCs/>
+                <w:color w:val="F59E0B"/>
+                <w:sz w:val="20"/>
+                <w:szCs w:val="20"/>
+              </w:rPr>
+              <w:t>NOTA</w:t>
+            </w:r>
+          </w:p>
+          <w:p>
+            <w:pPr>
+              <w:spacing w:after="40"/>
+              <w:rPr>
+                <w:sz w:val="21"/>
+                <w:szCs w:val="21"/>
+              </w:rPr>
+            </w:pPr>
+            <w:r>
+              <w:rPr>
+                <w:sz w:val="21"/>
+                <w:szCs w:val="21"/>
+              </w:rPr>
+              <w:t>Los documentos que se carguen deben estar guardados en archivo .</w:t>
+            </w:r>
+            <w:proofErr w:type="gramStart"/>
+            <w:r>
+              <w:rPr>
+                <w:sz w:val="21"/>
+                <w:szCs w:val="21"/>
+              </w:rPr>
+              <w:t>csv</w:t>
+            </w:r>
+            <w:proofErr w:type="gramEnd"/>
+            <w:r>
+              <w:rPr>
+                <w:sz w:val="21"/>
+                <w:szCs w:val="21"/>
+              </w:rPr>
+              <w:t xml:space="preserve"> pero en formato (MS-DOS), esto se lo puede obtener en “guardar como” y escoger el tipo de extensión del documento.</w:t>
             </w:r>
           </w:p>
         </w:tc>
@@ -7711,7 +8217,10 @@
         <w:spacing w:after="120"/>
       </w:pPr>
       <w:r>
-        <w:t>Las gráficas se generan automáticamente al seleccionar una boya y un rango de tiempo. El sistema adapta la resolución temporal según el período:</w:t>
+        <w:t xml:space="preserve">Las gráficas se generan automáticamente al seleccionar una boya y un rango de tiempo. El sistema adapta la resolución temporal </w:t>
+      </w:r>
+      <w:r>
+        <w:t>según el período:</w:t>
       </w:r>
     </w:p>
     <w:tbl>
@@ -7957,7 +8466,10 @@
         <w:t xml:space="preserve">2.  </w:t>
       </w:r>
       <w:r>
-        <w:t>Elige el rango de tiempo (24h, 3 días, semana, mes, etc.).</w:t>
+        <w:t xml:space="preserve">Elige el rango de tiempo </w:t>
+      </w:r>
+      <w:r>
+        <w:t>(24h, 3 días, semana, mes, etc.).</w:t>
       </w:r>
     </w:p>
     <w:p>
@@ -8009,7 +8521,6 @@
         <w:rPr>
           <w:noProof/>
         </w:rPr>
-        <w:lastRenderedPageBreak/>
         <w:drawing>
           <wp:inline distT="0" distB="0" distL="0" distR="0" wp14:anchorId="58D2BBBA" wp14:editId="246462A2">
             <wp:extent cx="4907280" cy="678977"/>
@@ -8055,14 +8566,27 @@
       <w:r>
         <w:t xml:space="preserve">Ilustración </w:t>
       </w:r>
-      <w:fldSimple w:instr=" SEQ Ilustración \* ARABIC ">
-        <w:r>
-          <w:rPr>
-            <w:noProof/>
-          </w:rPr>
-          <w:t>19</w:t>
-        </w:r>
-      </w:fldSimple>
+      <w:r>
+        <w:fldChar w:fldCharType="begin"/>
+      </w:r>
+      <w:r>
+        <w:instrText xml:space="preserve"> SEQ Ilustración \* ARABIC </w:instrText>
+      </w:r>
+      <w:r>
+        <w:fldChar w:fldCharType="separate"/>
+      </w:r>
+      <w:r>
+        <w:rPr>
+          <w:noProof/>
+        </w:rPr>
+        <w:t>19</w:t>
+      </w:r>
+      <w:r>
+        <w:rPr>
+          <w:noProof/>
+        </w:rPr>
+        <w:fldChar w:fldCharType="end"/>
+      </w:r>
       <w:r>
         <w:t xml:space="preserve"> Tarjetas de mediciones</w:t>
       </w:r>
@@ -8122,14 +8646,27 @@
       <w:r>
         <w:t xml:space="preserve">Ilustración </w:t>
       </w:r>
-      <w:fldSimple w:instr=" SEQ Ilustración \* ARABIC ">
-        <w:r>
-          <w:rPr>
-            <w:noProof/>
-          </w:rPr>
-          <w:t>20</w:t>
-        </w:r>
-      </w:fldSimple>
+      <w:r>
+        <w:fldChar w:fldCharType="begin"/>
+      </w:r>
+      <w:r>
+        <w:instrText xml:space="preserve"> SEQ Ilustración \* ARABIC </w:instrText>
+      </w:r>
+      <w:r>
+        <w:fldChar w:fldCharType="separate"/>
+      </w:r>
+      <w:r>
+        <w:rPr>
+          <w:noProof/>
+        </w:rPr>
+        <w:t>20</w:t>
+      </w:r>
+      <w:r>
+        <w:rPr>
+          <w:noProof/>
+        </w:rPr>
+        <w:fldChar w:fldCharType="end"/>
+      </w:r>
       <w:r>
         <w:t xml:space="preserve"> Gráfica detallada</w:t>
       </w:r>
@@ -8160,7 +8697,10 @@
         <w:spacing w:after="120"/>
       </w:pPr>
       <w:r>
-        <w:t>Debajo de las tarjetas de sensores aparece la tabla de estadísticas, calculada sobre los puntos cargados en el rango y boya seleccionados. Los valores se formatean automáticamente con dos decimales.</w:t>
+        <w:t xml:space="preserve">Debajo de las tarjetas de sensores aparece la tabla de estadísticas, calculada sobre los puntos </w:t>
+      </w:r>
+      <w:r>
+        <w:t>cargados en el rango y boya seleccionados. Los valores se formatean automáticamente con dos decimales.</w:t>
       </w:r>
     </w:p>
     <w:p>
@@ -8223,14 +8763,27 @@
       <w:r>
         <w:t xml:space="preserve">Ilustración </w:t>
       </w:r>
-      <w:fldSimple w:instr=" SEQ Ilustración \* ARABIC ">
-        <w:r>
-          <w:rPr>
-            <w:noProof/>
-          </w:rPr>
-          <w:t>21</w:t>
-        </w:r>
-      </w:fldSimple>
+      <w:r>
+        <w:fldChar w:fldCharType="begin"/>
+      </w:r>
+      <w:r>
+        <w:instrText xml:space="preserve"> SEQ Ilustración \* ARABIC </w:instrText>
+      </w:r>
+      <w:r>
+        <w:fldChar w:fldCharType="separate"/>
+      </w:r>
+      <w:r>
+        <w:rPr>
+          <w:noProof/>
+        </w:rPr>
+        <w:t>21</w:t>
+      </w:r>
+      <w:r>
+        <w:rPr>
+          <w:noProof/>
+        </w:rPr>
+        <w:fldChar w:fldCharType="end"/>
+      </w:r>
       <w:r>
         <w:t xml:space="preserve"> Tabla de estadística</w:t>
       </w:r>
@@ -8364,7 +8917,15 @@
                 <w:sz w:val="20"/>
                 <w:szCs w:val="20"/>
               </w:rPr>
-              <w:t>Nombre del sensor tal como está registrado en la boya.</w:t>
+              <w:t xml:space="preserve">Nombre del sensor tal como está registrado en la </w:t>
+            </w:r>
+            <w:r>
+              <w:rPr>
+                <w:color w:val="000000"/>
+                <w:sz w:val="20"/>
+                <w:szCs w:val="20"/>
+              </w:rPr>
+              <w:t>boya.</w:t>
             </w:r>
           </w:p>
         </w:tc>
@@ -8593,7 +9154,15 @@
                 <w:sz w:val="20"/>
                 <w:szCs w:val="20"/>
               </w:rPr>
-              <w:t>Valor central al ordenar todos los puntos. Menos sensible a valores extremos que la media.</w:t>
+              <w:t xml:space="preserve">Valor central al </w:t>
+            </w:r>
+            <w:r>
+              <w:rPr>
+                <w:color w:val="000000"/>
+                <w:sz w:val="20"/>
+                <w:szCs w:val="20"/>
+              </w:rPr>
+              <w:t>ordenar todos los puntos. Menos sensible a valores extremos que la media.</w:t>
             </w:r>
           </w:p>
         </w:tc>
@@ -8729,7 +9298,14 @@
                 <w:sz w:val="21"/>
                 <w:szCs w:val="21"/>
               </w:rPr>
-              <w:t>Las estadísticas se recalculan automáticamente al cambiar la boya o el rango de tiempo. Si el período incluye datos de una carga reciente, haz clic en Actualizar primero.</w:t>
+              <w:t xml:space="preserve">Las estadísticas se recalculan automáticamente al cambiar la </w:t>
+            </w:r>
+            <w:r>
+              <w:rPr>
+                <w:sz w:val="21"/>
+                <w:szCs w:val="21"/>
+              </w:rPr>
+              <w:t>boya o el rango de tiempo. Si el período incluye datos de una carga reciente, haz clic en Actualizar primero.</w:t>
             </w:r>
           </w:p>
         </w:tc>
@@ -8831,7 +9407,10 @@
         <w:spacing w:before="360" w:after="80"/>
       </w:pPr>
       <w:r>
-        <w:t>Notas y observaciones en las gráficas</w:t>
+        <w:t>Reportes de</w:t>
+      </w:r>
+      <w:r>
+        <w:t xml:space="preserve"> las gráficas</w:t>
       </w:r>
     </w:p>
     <w:p>
@@ -8992,14 +9571,27 @@
       <w:r>
         <w:t xml:space="preserve">Ilustración </w:t>
       </w:r>
-      <w:fldSimple w:instr=" SEQ Ilustración \* ARABIC ">
-        <w:r>
-          <w:rPr>
-            <w:noProof/>
-          </w:rPr>
-          <w:t>22</w:t>
-        </w:r>
-      </w:fldSimple>
+      <w:r>
+        <w:fldChar w:fldCharType="begin"/>
+      </w:r>
+      <w:r>
+        <w:instrText xml:space="preserve"> SEQ Ilustración \* ARABIC </w:instrText>
+      </w:r>
+      <w:r>
+        <w:fldChar w:fldCharType="separate"/>
+      </w:r>
+      <w:r>
+        <w:rPr>
+          <w:noProof/>
+        </w:rPr>
+        <w:t>22</w:t>
+      </w:r>
+      <w:r>
+        <w:rPr>
+          <w:noProof/>
+        </w:rPr>
+        <w:fldChar w:fldCharType="end"/>
+      </w:r>
       <w:r>
         <w:t xml:space="preserve"> Panel de alertas</w:t>
       </w:r>
@@ -9224,7 +9816,10 @@
         <w:spacing w:after="80"/>
       </w:pPr>
       <w:r>
-        <w:t>Mensaje descriptivo: indica si el valor está por encima o por debajo del umbral y cuál es el límite superado.</w:t>
+        <w:t xml:space="preserve">Mensaje </w:t>
+      </w:r>
+      <w:r>
+        <w:t>descriptivo: indica si el valor está por encima o por debajo del umbral y cuál es el límite superado.</w:t>
       </w:r>
     </w:p>
     <w:p>
@@ -9301,7 +9896,14 @@
                 <w:sz w:val="21"/>
                 <w:szCs w:val="21"/>
               </w:rPr>
-              <w:t>La fecha mostrada corresponde al momento de la última lectura disponible en la base de datos, no necesariamente al tiempo actual. Si no se han cargado datos recientes, la alerta puede referirse a una medición anterior.</w:t>
+              <w:t>La fecha mostrada corresponde al momento de la última lectur</w:t>
+            </w:r>
+            <w:r>
+              <w:rPr>
+                <w:sz w:val="21"/>
+                <w:szCs w:val="21"/>
+              </w:rPr>
+              <w:t>a disponible en la base de datos, no necesariamente al tiempo actual. Si no se han cargado datos recientes, la alerta puede referirse a una medición anterior.</w:t>
             </w:r>
           </w:p>
         </w:tc>
@@ -9345,7 +9947,7 @@
 </file>
 
 <file path=word/numbering.xml><?xml version="1.0" encoding="utf-8"?>
-<w:numbering xmlns:wpc="http://schemas.microsoft.com/office/word/2010/wordprocessingCanvas" xmlns:cx="http://schemas.microsoft.com/office/drawing/2014/chartex" xmlns:cx1="http://schemas.microsoft.com/office/drawing/2015/9/8/chartex" xmlns:cx2="http://schemas.microsoft.com/office/drawing/2015/10/21/chartex" xmlns:cx3="http://schemas.microsoft.com/office/drawing/2016/5/9/chartex" xmlns:cx4="http://schemas.microsoft.com/office/drawing/2016/5/10/chartex" xmlns:cx5="http://schemas.microsoft.com/office/drawing/2016/5/11/chartex" xmlns:cx6="http://schemas.microsoft.com/office/drawing/2016/5/12/chartex" xmlns:cx7="http://schemas.microsoft.com/office/drawing/2016/5/13/chartex" xmlns:cx8="http://schemas.microsoft.com/office/drawing/2016/5/14/chartex" xmlns:mc="http://schemas.openxmlformats.org/markup-compatibility/2006" xmlns:aink="http://schemas.microsoft.com/office/drawing/2016/ink" xmlns:am3d="http://schemas.microsoft.com/office/drawing/2017/model3d" xmlns:o="urn:schemas-microsoft-com:office:office" xmlns:oel="http://schemas.microsoft.com/office/2019/extlst" xmlns:r="http://schemas.openxmlformats.org/officeDocument/2006/relationships" xmlns:m="http://schemas.openxmlformats.org/officeDocument/2006/math" xmlns:v="urn:schemas-microsoft-com:vml" xmlns:wp14="http://schemas.microsoft.com/office/word/2010/wordprocessingDrawing" xmlns:wp="http://schemas.openxmlformats.org/drawingml/2006/wordprocessingDrawing" xmlns:w10="urn:schemas-microsoft-com:office:word" xmlns:w="http://schemas.openxmlformats.org/wordprocessingml/2006/main" xmlns:w14="http://schemas.microsoft.com/office/word/2010/wordml" xmlns:w15="http://schemas.microsoft.com/office/word/2012/wordml" xmlns:w16cex="http://schemas.microsoft.com/office/word/2018/wordml/cex" xmlns:w16cid="http://schemas.microsoft.com/office/word/2016/wordml/cid" xmlns:w16="http://schemas.microsoft.com/office/word/2018/wordml" xmlns:w16du="http://schemas.microsoft.com/office/word/2023/wordml/word16du" xmlns:w16sdtdh="http://schemas.microsoft.com/office/word/2020/wordml/sdtdatahash" xmlns:w16sdtfl="http://schemas.microsoft.com/office/word/2024/wordml/sdtformatlock" xmlns:w16se="http://schemas.microsoft.com/office/word/2015/wordml/symex" xmlns:wpg="http://schemas.microsoft.com/office/word/2010/wordprocessingGroup" xmlns:wpi="http://schemas.microsoft.com/office/word/2010/wordprocessingInk" xmlns:wne="http://schemas.microsoft.com/office/word/2006/wordml" xmlns:wps="http://schemas.microsoft.com/office/word/2010/wordprocessingShape" mc:Ignorable="w14 w15 w16se w16cid w16 w16cex w16sdtdh w16sdtfl w16du wp14">
+<w:numbering xmlns:wpc="http://schemas.microsoft.com/office/word/2010/wordprocessingCanvas" xmlns:cx="http://schemas.microsoft.com/office/drawing/2014/chartex" xmlns:cx1="http://schemas.microsoft.com/office/drawing/2015/9/8/chartex" xmlns:cx2="http://schemas.microsoft.com/office/drawing/2015/10/21/chartex" xmlns:cx3="http://schemas.microsoft.com/office/drawing/2016/5/9/chartex" xmlns:cx4="http://schemas.microsoft.com/office/drawing/2016/5/10/chartex" xmlns:cx5="http://schemas.microsoft.com/office/drawing/2016/5/11/chartex" xmlns:cx6="http://schemas.microsoft.com/office/drawing/2016/5/12/chartex" xmlns:cx7="http://schemas.microsoft.com/office/drawing/2016/5/13/chartex" xmlns:cx8="http://schemas.microsoft.com/office/drawing/2016/5/14/chartex" xmlns:mc="http://schemas.openxmlformats.org/markup-compatibility/2006" xmlns:aink="http://schemas.microsoft.com/office/drawing/2016/ink" xmlns:am3d="http://schemas.microsoft.com/office/drawing/2017/model3d" xmlns:o="urn:schemas-microsoft-com:office:office" xmlns:r="http://schemas.openxmlformats.org/officeDocument/2006/relationships" xmlns:m="http://schemas.openxmlformats.org/officeDocument/2006/math" xmlns:v="urn:schemas-microsoft-com:vml" xmlns:wp14="http://schemas.microsoft.com/office/word/2010/wordprocessingDrawing" xmlns:wp="http://schemas.openxmlformats.org/drawingml/2006/wordprocessingDrawing" xmlns:w10="urn:schemas-microsoft-com:office:word" xmlns:w="http://schemas.openxmlformats.org/wordprocessingml/2006/main" xmlns:w14="http://schemas.microsoft.com/office/word/2010/wordml" xmlns:w15="http://schemas.microsoft.com/office/word/2012/wordml" xmlns:w16cex="http://schemas.microsoft.com/office/word/2018/wordml/cex" xmlns:w16cid="http://schemas.microsoft.com/office/word/2016/wordml/cid" xmlns:w16="http://schemas.microsoft.com/office/word/2018/wordml" xmlns:w16sdtdh="http://schemas.microsoft.com/office/word/2020/wordml/sdtdatahash" xmlns:w16se="http://schemas.microsoft.com/office/word/2015/wordml/symex" xmlns:wpg="http://schemas.microsoft.com/office/word/2010/wordprocessingGroup" xmlns:wpi="http://schemas.microsoft.com/office/word/2010/wordprocessingInk" xmlns:wne="http://schemas.microsoft.com/office/word/2006/wordml" xmlns:wps="http://schemas.microsoft.com/office/word/2010/wordprocessingShape" mc:Ignorable="w14 w15 w16se w16cid w16 w16cex w16sdtdh wp14">
   <w:abstractNum w:abstractNumId="0" w15:restartNumberingAfterBreak="0">
     <w:nsid w:val="093430A6"/>
     <w:multiLevelType w:val="hybridMultilevel"/>
@@ -10938,56 +11540,56 @@
       </w:rPr>
     </w:lvl>
   </w:abstractNum>
-  <w:num w:numId="1" w16cid:durableId="5792265">
+  <w:num w:numId="1">
     <w:abstractNumId w:val="0"/>
     <w:lvlOverride w:ilvl="0">
       <w:startOverride w:val="1"/>
     </w:lvlOverride>
   </w:num>
-  <w:num w:numId="2" w16cid:durableId="1283070739">
+  <w:num w:numId="2">
     <w:abstractNumId w:val="10"/>
   </w:num>
-  <w:num w:numId="3" w16cid:durableId="110786006">
+  <w:num w:numId="3">
     <w:abstractNumId w:val="13"/>
   </w:num>
-  <w:num w:numId="4" w16cid:durableId="1334258363">
+  <w:num w:numId="4">
     <w:abstractNumId w:val="2"/>
   </w:num>
-  <w:num w:numId="5" w16cid:durableId="1845588501">
+  <w:num w:numId="5">
     <w:abstractNumId w:val="3"/>
   </w:num>
-  <w:num w:numId="6" w16cid:durableId="1851334850">
+  <w:num w:numId="6">
     <w:abstractNumId w:val="1"/>
   </w:num>
-  <w:num w:numId="7" w16cid:durableId="2028558134">
+  <w:num w:numId="7">
     <w:abstractNumId w:val="8"/>
   </w:num>
-  <w:num w:numId="8" w16cid:durableId="821433423">
+  <w:num w:numId="8">
     <w:abstractNumId w:val="4"/>
   </w:num>
-  <w:num w:numId="9" w16cid:durableId="1746219200">
+  <w:num w:numId="9">
     <w:abstractNumId w:val="7"/>
   </w:num>
-  <w:num w:numId="10" w16cid:durableId="2057242251">
+  <w:num w:numId="10">
     <w:abstractNumId w:val="6"/>
   </w:num>
-  <w:num w:numId="11" w16cid:durableId="1521819757">
+  <w:num w:numId="11">
     <w:abstractNumId w:val="11"/>
   </w:num>
-  <w:num w:numId="12" w16cid:durableId="1053963409">
+  <w:num w:numId="12">
     <w:abstractNumId w:val="12"/>
   </w:num>
-  <w:num w:numId="13" w16cid:durableId="184100354">
+  <w:num w:numId="13">
     <w:abstractNumId w:val="5"/>
   </w:num>
-  <w:num w:numId="14" w16cid:durableId="92284654">
+  <w:num w:numId="14">
     <w:abstractNumId w:val="9"/>
   </w:num>
 </w:numbering>
 </file>
 
 <file path=word/styles.xml><?xml version="1.0" encoding="utf-8"?>
-<w:styles xmlns:mc="http://schemas.openxmlformats.org/markup-compatibility/2006" xmlns:r="http://schemas.openxmlformats.org/officeDocument/2006/relationships" xmlns:w="http://schemas.openxmlformats.org/wordprocessingml/2006/main" xmlns:w14="http://schemas.microsoft.com/office/word/2010/wordml" xmlns:w15="http://schemas.microsoft.com/office/word/2012/wordml" xmlns:w16cex="http://schemas.microsoft.com/office/word/2018/wordml/cex" xmlns:w16cid="http://schemas.microsoft.com/office/word/2016/wordml/cid" xmlns:w16="http://schemas.microsoft.com/office/word/2018/wordml" xmlns:w16du="http://schemas.microsoft.com/office/word/2023/wordml/word16du" xmlns:w16sdtdh="http://schemas.microsoft.com/office/word/2020/wordml/sdtdatahash" xmlns:w16sdtfl="http://schemas.microsoft.com/office/word/2024/wordml/sdtformatlock" xmlns:w16se="http://schemas.microsoft.com/office/word/2015/wordml/symex" mc:Ignorable="w14 w15 w16se w16cid w16 w16cex w16sdtdh w16sdtfl w16du">
+<w:styles xmlns:mc="http://schemas.openxmlformats.org/markup-compatibility/2006" xmlns:r="http://schemas.openxmlformats.org/officeDocument/2006/relationships" xmlns:w="http://schemas.openxmlformats.org/wordprocessingml/2006/main" xmlns:w14="http://schemas.microsoft.com/office/word/2010/wordml" xmlns:w15="http://schemas.microsoft.com/office/word/2012/wordml" xmlns:w16cex="http://schemas.microsoft.com/office/word/2018/wordml/cex" xmlns:w16cid="http://schemas.microsoft.com/office/word/2016/wordml/cid" xmlns:w16="http://schemas.microsoft.com/office/word/2018/wordml" xmlns:w16sdtdh="http://schemas.microsoft.com/office/word/2020/wordml/sdtdatahash" xmlns:w16se="http://schemas.microsoft.com/office/word/2015/wordml/symex" mc:Ignorable="w14 w15 w16se w16cid w16 w16cex w16sdtdh">
   <w:docDefaults>
     <w:rPrDefault>
       <w:rPr>

</xml_diff>